<commit_message>
added spike report for task 3
</commit_message>
<xml_diff>
--- a/03 - Spike - Gridworld/Task 3 - Spike Report GridWorld.docx
+++ b/03 - Spike - Gridworld/Task 3 - Spike Report GridWorld.docx
@@ -188,15 +188,17 @@
           <w:rStyle w:val="SubtleReference"/>
           <w:rFonts w:ascii="Abadi" w:hAnsi="Abadi"/>
         </w:rPr>
-        <w:t>For example: UML diagram</w:t>
-      </w:r>
-      <w:r>
-        <w:rPr>
-          <w:rStyle w:val="SubtleReference"/>
-          <w:rFonts w:ascii="Abadi" w:hAnsi="Abadi"/>
-        </w:rPr>
-        <w:t>, code, reports</w:t>
-      </w:r>
+        <w:t xml:space="preserve">Besides this report, we created C++ code and a flow chart as shown </w:t>
+      </w:r>
+      <w:proofErr w:type="gramStart"/>
+      <w:r>
+        <w:rPr>
+          <w:rStyle w:val="SubtleReference"/>
+          <w:rFonts w:ascii="Abadi" w:hAnsi="Abadi"/>
+        </w:rPr>
+        <w:t>below</w:t>
+      </w:r>
+      <w:proofErr w:type="gramEnd"/>
     </w:p>
     <w:p>
       <w:pPr>
@@ -379,8 +381,17 @@
           <w:rStyle w:val="SubtleReference"/>
           <w:rFonts w:ascii="Abadi" w:hAnsi="Abadi"/>
         </w:rPr>
-        <w:t>List of information needed by someone trying to reproduce this work</w:t>
-      </w:r>
+        <w:t xml:space="preserve">List of information needed by someone trying to reproduce this </w:t>
+      </w:r>
+      <w:proofErr w:type="gramStart"/>
+      <w:r>
+        <w:rPr>
+          <w:rStyle w:val="SubtleReference"/>
+          <w:rFonts w:ascii="Abadi" w:hAnsi="Abadi"/>
+        </w:rPr>
+        <w:t>work</w:t>
+      </w:r>
+      <w:proofErr w:type="gramEnd"/>
     </w:p>
     <w:p>
       <w:pPr>
@@ -440,10 +451,8 @@
         </w:numPr>
         <w:spacing w:line="360" w:lineRule="auto"/>
         <w:rPr>
-          <w:rFonts w:ascii="Abadi" w:hAnsi="Abadi"/>
-          <w:color w:val="5A5A5A" w:themeColor="text1" w:themeTint="A5"/>
-          <w:sz w:val="28"/>
-          <w:szCs w:val="28"/>
+          <w:rStyle w:val="SubtleReference"/>
+          <w:rFonts w:ascii="Abadi" w:hAnsi="Abadi"/>
         </w:rPr>
       </w:pPr>
       <w:r>
@@ -474,39 +483,6 @@
     </w:p>
     <w:p>
       <w:pPr>
-        <w:pStyle w:val="ColorfulList-Accent11"/>
-        <w:spacing w:line="360" w:lineRule="auto"/>
-        <w:ind w:left="360"/>
-        <w:rPr>
-          <w:rStyle w:val="SubtleReference"/>
-          <w:rFonts w:ascii="Abadi" w:hAnsi="Abadi"/>
-        </w:rPr>
-      </w:pPr>
-    </w:p>
-    <w:p>
-      <w:pPr>
-        <w:pStyle w:val="ColorfulList-Accent11"/>
-        <w:spacing w:line="360" w:lineRule="auto"/>
-        <w:ind w:left="360"/>
-        <w:rPr>
-          <w:rStyle w:val="SubtleReference"/>
-          <w:rFonts w:ascii="Abadi" w:hAnsi="Abadi"/>
-        </w:rPr>
-      </w:pPr>
-    </w:p>
-    <w:p>
-      <w:pPr>
-        <w:pStyle w:val="ColorfulList-Accent11"/>
-        <w:spacing w:line="360" w:lineRule="auto"/>
-        <w:ind w:left="360"/>
-        <w:rPr>
-          <w:rStyle w:val="SubtleReference"/>
-          <w:rFonts w:ascii="Abadi" w:hAnsi="Abadi"/>
-        </w:rPr>
-      </w:pPr>
-    </w:p>
-    <w:p>
-      <w:pPr>
         <w:spacing w:line="360" w:lineRule="auto"/>
         <w:rPr>
           <w:rFonts w:ascii="Abadi" w:hAnsi="Abadi"/>
@@ -520,6 +496,7 @@
           <w:b/>
           <w:sz w:val="24"/>
         </w:rPr>
+        <w:lastRenderedPageBreak/>
         <w:t xml:space="preserve">Tasks undertaken: </w:t>
       </w:r>
     </w:p>
@@ -538,43 +515,42 @@
           <w:rStyle w:val="SubtleReference"/>
           <w:rFonts w:ascii="Abadi" w:hAnsi="Abadi"/>
         </w:rPr>
-        <w:t>List key tasks likely to help another developer</w:t>
-      </w:r>
-    </w:p>
-    <w:p>
-      <w:pPr>
-        <w:pStyle w:val="ColorfulList-Accent11"/>
-        <w:spacing w:line="360" w:lineRule="auto"/>
-        <w:ind w:left="0"/>
-        <w:rPr>
-          <w:rStyle w:val="SubtleReference"/>
-          <w:rFonts w:ascii="Abadi" w:hAnsi="Abadi"/>
-        </w:rPr>
-      </w:pPr>
-      <w:r>
-        <w:rPr>
-          <w:rStyle w:val="SubtleReference"/>
-          <w:rFonts w:ascii="Abadi" w:hAnsi="Abadi"/>
-        </w:rPr>
-        <w:t>This section should resemble a tutorial – the goal is to allow another coder to reproduce your work following these steps.</w:t>
-      </w:r>
-    </w:p>
-    <w:p>
-      <w:pPr>
-        <w:pStyle w:val="ColorfulList-Accent11"/>
-        <w:spacing w:line="360" w:lineRule="auto"/>
-        <w:ind w:left="0"/>
-        <w:rPr>
-          <w:rStyle w:val="SubtleReference"/>
-          <w:rFonts w:ascii="Abadi" w:hAnsi="Abadi"/>
-        </w:rPr>
-      </w:pPr>
-      <w:r>
-        <w:rPr>
-          <w:rStyle w:val="SubtleReference"/>
-          <w:rFonts w:ascii="Abadi" w:hAnsi="Abadi"/>
-        </w:rPr>
-        <w:t>Eg: (Good)</w:t>
+        <w:t>T</w:t>
+      </w:r>
+      <w:r>
+        <w:rPr>
+          <w:rStyle w:val="SubtleReference"/>
+          <w:rFonts w:ascii="Abadi" w:hAnsi="Abadi"/>
+        </w:rPr>
+        <w:t xml:space="preserve">o allow another coder to reproduce </w:t>
+      </w:r>
+      <w:r>
+        <w:rPr>
+          <w:rStyle w:val="SubtleReference"/>
+          <w:rFonts w:ascii="Abadi" w:hAnsi="Abadi"/>
+        </w:rPr>
+        <w:t>this</w:t>
+      </w:r>
+      <w:r>
+        <w:rPr>
+          <w:rStyle w:val="SubtleReference"/>
+          <w:rFonts w:ascii="Abadi" w:hAnsi="Abadi"/>
+        </w:rPr>
+        <w:t xml:space="preserve"> work</w:t>
+      </w:r>
+      <w:r>
+        <w:rPr>
+          <w:rStyle w:val="SubtleReference"/>
+          <w:rFonts w:ascii="Abadi" w:hAnsi="Abadi"/>
+        </w:rPr>
+        <w:t>, they would need to</w:t>
+      </w:r>
+      <w:r>
+        <w:rPr>
+          <w:rStyle w:val="SubtleReference"/>
+          <w:rFonts w:ascii="Abadi" w:hAnsi="Abadi"/>
+        </w:rPr>
+        <w:t xml:space="preserve"> follow these steps.</w:t>
       </w:r>
     </w:p>
     <w:p>
@@ -597,6 +573,13 @@
         </w:rPr>
         <w:t>Download and install Visual Studio</w:t>
       </w:r>
+      <w:r>
+        <w:rPr>
+          <w:rStyle w:val="SubtleReference"/>
+          <w:rFonts w:ascii="Abadi" w:hAnsi="Abadi"/>
+        </w:rPr>
+        <w:t xml:space="preserve"> Code</w:t>
+      </w:r>
     </w:p>
     <w:p>
       <w:pPr>
@@ -616,7 +599,14 @@
           <w:rStyle w:val="SubtleReference"/>
           <w:rFonts w:ascii="Abadi" w:hAnsi="Abadi"/>
         </w:rPr>
-        <w:t>Download and install DirectX</w:t>
+        <w:t xml:space="preserve">Download and install </w:t>
+      </w:r>
+      <w:r>
+        <w:rPr>
+          <w:rStyle w:val="SubtleReference"/>
+          <w:rFonts w:ascii="Abadi" w:hAnsi="Abadi"/>
+        </w:rPr>
+        <w:t xml:space="preserve">MinGW. </w:t>
       </w:r>
     </w:p>
     <w:p>
@@ -637,7 +627,14 @@
           <w:rStyle w:val="SubtleReference"/>
           <w:rFonts w:ascii="Abadi" w:hAnsi="Abadi"/>
         </w:rPr>
-        <w:t>Configure VS Project File to point to the DX lib folder</w:t>
+        <w:t xml:space="preserve">Configure </w:t>
+      </w:r>
+      <w:r>
+        <w:rPr>
+          <w:rStyle w:val="SubtleReference"/>
+          <w:rFonts w:ascii="Abadi" w:hAnsi="Abadi"/>
+        </w:rPr>
+        <w:t>Path to MinGW directory.</w:t>
       </w:r>
     </w:p>
     <w:p>
@@ -649,34 +646,40 @@
         </w:numPr>
         <w:spacing w:line="360" w:lineRule="auto"/>
         <w:rPr>
-          <w:rStyle w:val="SubtleReference"/>
-          <w:rFonts w:ascii="Abadi" w:hAnsi="Abadi"/>
-        </w:rPr>
-      </w:pPr>
-      <w:r>
-        <w:rPr>
-          <w:rStyle w:val="SubtleReference"/>
-          <w:rFonts w:ascii="Abadi" w:hAnsi="Abadi"/>
-        </w:rPr>
-        <w:t>Compile sample code</w:t>
-      </w:r>
-    </w:p>
-    <w:p>
-      <w:pPr>
-        <w:pStyle w:val="ColorfulList-Accent11"/>
-        <w:spacing w:line="360" w:lineRule="auto"/>
-        <w:ind w:left="0"/>
-        <w:rPr>
-          <w:rStyle w:val="SubtleReference"/>
-          <w:rFonts w:ascii="Abadi" w:hAnsi="Abadi"/>
-        </w:rPr>
-      </w:pPr>
-      <w:r>
-        <w:rPr>
-          <w:rStyle w:val="SubtleReference"/>
-          <w:rFonts w:ascii="Abadi" w:hAnsi="Abadi"/>
-        </w:rPr>
-        <w:t>Not: (Bad)</w:t>
+          <w:rFonts w:ascii="Abadi" w:hAnsi="Abadi"/>
+          <w:color w:val="5A5A5A" w:themeColor="text1" w:themeTint="A5"/>
+          <w:sz w:val="28"/>
+          <w:szCs w:val="28"/>
+        </w:rPr>
+      </w:pPr>
+      <w:r>
+        <w:rPr>
+          <w:rFonts w:ascii="Abadi" w:hAnsi="Abadi"/>
+          <w:color w:val="5A5A5A" w:themeColor="text1" w:themeTint="A5"/>
+          <w:sz w:val="28"/>
+          <w:szCs w:val="28"/>
+        </w:rPr>
+        <w:t xml:space="preserve">Create a simple plan laying out what is required to achieve making </w:t>
+      </w:r>
+      <w:proofErr w:type="spellStart"/>
+      <w:r>
+        <w:rPr>
+          <w:rFonts w:ascii="Abadi" w:hAnsi="Abadi"/>
+          <w:color w:val="5A5A5A" w:themeColor="text1" w:themeTint="A5"/>
+          <w:sz w:val="28"/>
+          <w:szCs w:val="28"/>
+        </w:rPr>
+        <w:t>GridWorld</w:t>
+      </w:r>
+      <w:proofErr w:type="spellEnd"/>
+      <w:r>
+        <w:rPr>
+          <w:rFonts w:ascii="Abadi" w:hAnsi="Abadi"/>
+          <w:color w:val="5A5A5A" w:themeColor="text1" w:themeTint="A5"/>
+          <w:sz w:val="28"/>
+          <w:szCs w:val="28"/>
+        </w:rPr>
+        <w:t>.</w:t>
       </w:r>
     </w:p>
     <w:p>
@@ -688,16 +691,20 @@
         </w:numPr>
         <w:spacing w:line="360" w:lineRule="auto"/>
         <w:rPr>
-          <w:rStyle w:val="SubtleReference"/>
-          <w:rFonts w:ascii="Abadi" w:hAnsi="Abadi"/>
-        </w:rPr>
-      </w:pPr>
-      <w:r>
-        <w:rPr>
-          <w:rStyle w:val="SubtleReference"/>
-          <w:rFonts w:ascii="Abadi" w:hAnsi="Abadi"/>
-        </w:rPr>
-        <w:t>Read the source code</w:t>
+          <w:rFonts w:ascii="Abadi" w:hAnsi="Abadi"/>
+          <w:color w:val="5A5A5A" w:themeColor="text1" w:themeTint="A5"/>
+          <w:sz w:val="28"/>
+          <w:szCs w:val="28"/>
+        </w:rPr>
+      </w:pPr>
+      <w:r>
+        <w:rPr>
+          <w:rFonts w:ascii="Abadi" w:hAnsi="Abadi"/>
+          <w:color w:val="5A5A5A" w:themeColor="text1" w:themeTint="A5"/>
+          <w:sz w:val="28"/>
+          <w:szCs w:val="28"/>
+        </w:rPr>
+        <w:t>Creating a new C++ file in visual studio code.</w:t>
       </w:r>
     </w:p>
     <w:p>
@@ -709,16 +716,114 @@
         </w:numPr>
         <w:spacing w:line="360" w:lineRule="auto"/>
         <w:rPr>
-          <w:rStyle w:val="SubtleReference"/>
-          <w:rFonts w:ascii="Abadi" w:hAnsi="Abadi"/>
-        </w:rPr>
-      </w:pPr>
-      <w:r>
-        <w:rPr>
-          <w:rStyle w:val="SubtleReference"/>
-          <w:rFonts w:ascii="Abadi" w:hAnsi="Abadi"/>
-        </w:rPr>
-        <w:t>I had some trouble with SDL, so I spent a couple of weeks doing other spikes</w:t>
+          <w:rFonts w:ascii="Abadi" w:hAnsi="Abadi"/>
+          <w:color w:val="5A5A5A" w:themeColor="text1" w:themeTint="A5"/>
+          <w:sz w:val="28"/>
+          <w:szCs w:val="28"/>
+        </w:rPr>
+      </w:pPr>
+      <w:r>
+        <w:rPr>
+          <w:rFonts w:ascii="Abadi" w:hAnsi="Abadi"/>
+          <w:color w:val="5A5A5A" w:themeColor="text1" w:themeTint="A5"/>
+          <w:sz w:val="28"/>
+          <w:szCs w:val="28"/>
+        </w:rPr>
+        <w:t xml:space="preserve">Declaring variables </w:t>
+      </w:r>
+      <w:r>
+        <w:rPr>
+          <w:rFonts w:ascii="Abadi" w:hAnsi="Abadi"/>
+          <w:color w:val="5A5A5A" w:themeColor="text1" w:themeTint="A5"/>
+          <w:sz w:val="28"/>
+          <w:szCs w:val="28"/>
+        </w:rPr>
+        <w:t>to</w:t>
+      </w:r>
+      <w:r>
+        <w:rPr>
+          <w:rFonts w:ascii="Abadi" w:hAnsi="Abadi"/>
+          <w:color w:val="5A5A5A" w:themeColor="text1" w:themeTint="A5"/>
+          <w:sz w:val="28"/>
+          <w:szCs w:val="28"/>
+        </w:rPr>
+        <w:t xml:space="preserve"> create the </w:t>
+      </w:r>
+      <w:r>
+        <w:rPr>
+          <w:rFonts w:ascii="Abadi" w:hAnsi="Abadi"/>
+          <w:color w:val="5A5A5A" w:themeColor="text1" w:themeTint="A5"/>
+          <w:sz w:val="28"/>
+          <w:szCs w:val="28"/>
+        </w:rPr>
+        <w:t>grid.</w:t>
+      </w:r>
+      <w:r>
+        <w:rPr>
+          <w:rFonts w:ascii="Abadi" w:hAnsi="Abadi"/>
+          <w:noProof/>
+          <w:color w:val="5A5A5A" w:themeColor="text1" w:themeTint="A5"/>
+          <w:sz w:val="28"/>
+          <w:szCs w:val="28"/>
+        </w:rPr>
+        <w:t xml:space="preserve"> </w:t>
+      </w:r>
+      <w:r>
+        <w:rPr>
+          <w:rFonts w:ascii="Abadi" w:hAnsi="Abadi"/>
+          <w:noProof/>
+          <w:color w:val="5A5A5A" w:themeColor="text1" w:themeTint="A5"/>
+          <w:sz w:val="28"/>
+          <w:szCs w:val="28"/>
+        </w:rPr>
+        <w:drawing>
+          <wp:inline distT="0" distB="0" distL="0" distR="0" wp14:anchorId="37E41B33" wp14:editId="7DEC3343">
+            <wp:extent cx="2971800" cy="1304925"/>
+            <wp:effectExtent l="0" t="0" r="0" b="9525"/>
+            <wp:docPr id="1095324473" name="Picture 1"/>
+            <wp:cNvGraphicFramePr>
+              <a:graphicFrameLocks xmlns:a="http://schemas.openxmlformats.org/drawingml/2006/main" noChangeAspect="1"/>
+            </wp:cNvGraphicFramePr>
+            <a:graphic xmlns:a="http://schemas.openxmlformats.org/drawingml/2006/main">
+              <a:graphicData uri="http://schemas.openxmlformats.org/drawingml/2006/picture">
+                <pic:pic xmlns:pic="http://schemas.openxmlformats.org/drawingml/2006/picture">
+                  <pic:nvPicPr>
+                    <pic:cNvPr id="0" name="Picture 1"/>
+                    <pic:cNvPicPr>
+                      <a:picLocks noChangeAspect="1" noChangeArrowheads="1"/>
+                    </pic:cNvPicPr>
+                  </pic:nvPicPr>
+                  <pic:blipFill>
+                    <a:blip r:embed="rId9">
+                      <a:extLst>
+                        <a:ext uri="{28A0092B-C50C-407E-A947-70E740481C1C}">
+                          <a14:useLocalDpi xmlns:a14="http://schemas.microsoft.com/office/drawing/2010/main" val="0"/>
+                        </a:ext>
+                      </a:extLst>
+                    </a:blip>
+                    <a:srcRect/>
+                    <a:stretch>
+                      <a:fillRect/>
+                    </a:stretch>
+                  </pic:blipFill>
+                  <pic:spPr bwMode="auto">
+                    <a:xfrm>
+                      <a:off x="0" y="0"/>
+                      <a:ext cx="2971800" cy="1304925"/>
+                    </a:xfrm>
+                    <a:prstGeom prst="rect">
+                      <a:avLst/>
+                    </a:prstGeom>
+                    <a:noFill/>
+                    <a:ln>
+                      <a:noFill/>
+                    </a:ln>
+                  </pic:spPr>
+                </pic:pic>
+              </a:graphicData>
+            </a:graphic>
+          </wp:inline>
+        </w:drawing>
       </w:r>
     </w:p>
     <w:p>
@@ -730,16 +835,77 @@
         </w:numPr>
         <w:spacing w:line="360" w:lineRule="auto"/>
         <w:rPr>
-          <w:rStyle w:val="SubtleReference"/>
-          <w:rFonts w:ascii="Abadi" w:hAnsi="Abadi"/>
-        </w:rPr>
-      </w:pPr>
-      <w:r>
-        <w:rPr>
-          <w:rStyle w:val="SubtleReference"/>
-          <w:rFonts w:ascii="Abadi" w:hAnsi="Abadi"/>
-        </w:rPr>
-        <w:t>Run code</w:t>
+          <w:rFonts w:ascii="Abadi" w:hAnsi="Abadi"/>
+          <w:color w:val="5A5A5A" w:themeColor="text1" w:themeTint="A5"/>
+          <w:sz w:val="28"/>
+          <w:szCs w:val="28"/>
+        </w:rPr>
+      </w:pPr>
+      <w:r>
+        <w:rPr>
+          <w:rFonts w:ascii="Abadi" w:hAnsi="Abadi"/>
+          <w:color w:val="5A5A5A" w:themeColor="text1" w:themeTint="A5"/>
+          <w:sz w:val="28"/>
+          <w:szCs w:val="28"/>
+        </w:rPr>
+        <w:t xml:space="preserve">Create a structure to store player’s position. </w:t>
+      </w:r>
+      <w:r>
+        <w:rPr>
+          <w:rFonts w:ascii="Abadi" w:hAnsi="Abadi"/>
+          <w:noProof/>
+          <w:color w:val="5A5A5A" w:themeColor="text1" w:themeTint="A5"/>
+          <w:sz w:val="28"/>
+          <w:szCs w:val="28"/>
+        </w:rPr>
+        <w:drawing>
+          <wp:inline distT="0" distB="0" distL="0" distR="0" wp14:anchorId="51D388BD" wp14:editId="3B319B3E">
+            <wp:extent cx="3152775" cy="933450"/>
+            <wp:effectExtent l="0" t="0" r="9525" b="0"/>
+            <wp:docPr id="741904847" name="Picture 2"/>
+            <wp:cNvGraphicFramePr>
+              <a:graphicFrameLocks xmlns:a="http://schemas.openxmlformats.org/drawingml/2006/main" noChangeAspect="1"/>
+            </wp:cNvGraphicFramePr>
+            <a:graphic xmlns:a="http://schemas.openxmlformats.org/drawingml/2006/main">
+              <a:graphicData uri="http://schemas.openxmlformats.org/drawingml/2006/picture">
+                <pic:pic xmlns:pic="http://schemas.openxmlformats.org/drawingml/2006/picture">
+                  <pic:nvPicPr>
+                    <pic:cNvPr id="0" name="Picture 2"/>
+                    <pic:cNvPicPr>
+                      <a:picLocks noChangeAspect="1" noChangeArrowheads="1"/>
+                    </pic:cNvPicPr>
+                  </pic:nvPicPr>
+                  <pic:blipFill>
+                    <a:blip r:embed="rId10">
+                      <a:extLst>
+                        <a:ext uri="{28A0092B-C50C-407E-A947-70E740481C1C}">
+                          <a14:useLocalDpi xmlns:a14="http://schemas.microsoft.com/office/drawing/2010/main" val="0"/>
+                        </a:ext>
+                      </a:extLst>
+                    </a:blip>
+                    <a:srcRect/>
+                    <a:stretch>
+                      <a:fillRect/>
+                    </a:stretch>
+                  </pic:blipFill>
+                  <pic:spPr bwMode="auto">
+                    <a:xfrm>
+                      <a:off x="0" y="0"/>
+                      <a:ext cx="3152775" cy="933450"/>
+                    </a:xfrm>
+                    <a:prstGeom prst="rect">
+                      <a:avLst/>
+                    </a:prstGeom>
+                    <a:noFill/>
+                    <a:ln>
+                      <a:noFill/>
+                    </a:ln>
+                  </pic:spPr>
+                </pic:pic>
+              </a:graphicData>
+            </a:graphic>
+          </wp:inline>
+        </w:drawing>
       </w:r>
     </w:p>
     <w:p>
@@ -751,171 +917,87 @@
         </w:numPr>
         <w:spacing w:line="360" w:lineRule="auto"/>
         <w:rPr>
-          <w:rStyle w:val="SubtleReference"/>
-          <w:rFonts w:ascii="Abadi" w:hAnsi="Abadi"/>
-        </w:rPr>
-      </w:pPr>
-      <w:r>
-        <w:rPr>
-          <w:rStyle w:val="SubtleReference"/>
-          <w:rFonts w:ascii="Abadi" w:hAnsi="Abadi"/>
-        </w:rPr>
-        <w:t>Write Spike Report</w:t>
-      </w:r>
-    </w:p>
-    <w:p>
-      <w:pPr>
-        <w:pStyle w:val="ColorfulList-Accent11"/>
-        <w:spacing w:line="360" w:lineRule="auto"/>
-        <w:ind w:left="0"/>
-        <w:rPr>
-          <w:rFonts w:ascii="Abadi" w:hAnsi="Abadi"/>
-          <w:color w:val="5A5A5A" w:themeColor="text1" w:themeTint="A5"/>
-          <w:sz w:val="28"/>
-          <w:szCs w:val="28"/>
-        </w:rPr>
-      </w:pPr>
-    </w:p>
-    <w:p>
-      <w:pPr>
-        <w:spacing w:line="360" w:lineRule="auto"/>
-        <w:rPr>
-          <w:rFonts w:ascii="Abadi" w:hAnsi="Abadi"/>
-          <w:b/>
-          <w:sz w:val="24"/>
-        </w:rPr>
-      </w:pPr>
-      <w:r>
-        <w:rPr>
-          <w:rFonts w:ascii="Abadi" w:hAnsi="Abadi"/>
-          <w:b/>
-          <w:sz w:val="24"/>
-        </w:rPr>
-        <w:t>What we found out:</w:t>
-      </w:r>
-    </w:p>
-    <w:p>
-      <w:pPr>
-        <w:pStyle w:val="ColorfulList-Accent11"/>
-        <w:spacing w:line="360" w:lineRule="auto"/>
-        <w:ind w:left="0"/>
-        <w:rPr>
-          <w:rStyle w:val="SubtleReference"/>
-          <w:rFonts w:ascii="Abadi" w:hAnsi="Abadi"/>
-        </w:rPr>
-      </w:pPr>
-      <w:r>
-        <w:rPr>
-          <w:rStyle w:val="SubtleReference"/>
-          <w:rFonts w:ascii="Abadi" w:hAnsi="Abadi"/>
-        </w:rPr>
-        <w:t>Describe</w:t>
-      </w:r>
-      <w:r>
-        <w:rPr>
-          <w:rStyle w:val="SubtleReference"/>
-          <w:rFonts w:ascii="Abadi" w:hAnsi="Abadi"/>
-        </w:rPr>
-        <w:t xml:space="preserve"> the outcomes, and how they relate to the spike topic</w:t>
-      </w:r>
-      <w:r>
-        <w:rPr>
-          <w:rStyle w:val="SubtleReference"/>
-          <w:rFonts w:ascii="Abadi" w:hAnsi="Abadi"/>
-        </w:rPr>
-        <w:t xml:space="preserve"> + graphs/screenshots/out</w:t>
-      </w:r>
-      <w:r>
-        <w:rPr>
-          <w:rStyle w:val="SubtleReference"/>
-          <w:rFonts w:ascii="Abadi" w:hAnsi="Abadi"/>
-        </w:rPr>
-        <w:t>puts</w:t>
-      </w:r>
-      <w:r>
-        <w:rPr>
-          <w:rStyle w:val="SubtleReference"/>
-          <w:rFonts w:ascii="Abadi" w:hAnsi="Abadi"/>
-        </w:rPr>
-        <w:t xml:space="preserve"> as needed</w:t>
-      </w:r>
-    </w:p>
-    <w:p>
-      <w:pPr>
-        <w:spacing w:line="360" w:lineRule="auto"/>
-        <w:rPr>
-          <w:rStyle w:val="SubtleReference"/>
-          <w:rFonts w:ascii="Abadi" w:hAnsi="Abadi"/>
-        </w:rPr>
-      </w:pPr>
-    </w:p>
-    <w:p>
-      <w:pPr>
-        <w:spacing w:line="360" w:lineRule="auto"/>
-        <w:rPr>
-          <w:rFonts w:ascii="Abadi" w:hAnsi="Abadi"/>
-          <w:b/>
-          <w:sz w:val="24"/>
-        </w:rPr>
-      </w:pPr>
-      <w:r>
-        <w:rPr>
-          <w:rFonts w:ascii="Abadi" w:hAnsi="Abadi"/>
-          <w:b/>
-          <w:sz w:val="24"/>
-        </w:rPr>
-        <w:t xml:space="preserve">Open issues/risks </w:t>
-      </w:r>
-      <w:r>
-        <w:rPr>
-          <w:rFonts w:ascii="Abadi" w:hAnsi="Abadi"/>
-          <w:color w:val="FF0000"/>
-          <w:sz w:val="24"/>
-        </w:rPr>
-        <w:t xml:space="preserve">[Optional – </w:t>
-      </w:r>
-      <w:r>
-        <w:rPr>
-          <w:rFonts w:ascii="Abadi" w:hAnsi="Abadi"/>
-          <w:b/>
-          <w:color w:val="FF0000"/>
-          <w:sz w:val="24"/>
-        </w:rPr>
-        <w:t>remove</w:t>
-      </w:r>
-      <w:r>
-        <w:rPr>
-          <w:rFonts w:ascii="Abadi" w:hAnsi="Abadi"/>
-          <w:color w:val="FF0000"/>
-          <w:sz w:val="24"/>
-        </w:rPr>
-        <w:t xml:space="preserve"> heading/section if not used!]</w:t>
-      </w:r>
-      <w:r>
-        <w:rPr>
-          <w:rFonts w:ascii="Abadi" w:hAnsi="Abadi"/>
-          <w:b/>
-          <w:sz w:val="24"/>
-        </w:rPr>
-        <w:t>:</w:t>
-      </w:r>
-    </w:p>
-    <w:p>
-      <w:pPr>
-        <w:pStyle w:val="ColorfulList-Accent11"/>
-        <w:spacing w:line="360" w:lineRule="auto"/>
-        <w:ind w:left="0"/>
-        <w:rPr>
-          <w:rStyle w:val="SubtleReference"/>
-          <w:rFonts w:ascii="Abadi" w:hAnsi="Abadi"/>
-        </w:rPr>
-      </w:pPr>
-      <w:r>
-        <w:rPr>
-          <w:rStyle w:val="SubtleReference"/>
-          <w:rFonts w:ascii="Abadi" w:hAnsi="Abadi"/>
-        </w:rPr>
-        <w:t xml:space="preserve">List out the issues and risks that you have been unable to resolve at the end of the spike. You may have uncovered a whole range of new risks as well. </w:t>
+          <w:rFonts w:ascii="Abadi" w:hAnsi="Abadi"/>
+          <w:color w:val="5A5A5A" w:themeColor="text1" w:themeTint="A5"/>
+          <w:sz w:val="28"/>
+          <w:szCs w:val="28"/>
+        </w:rPr>
+      </w:pPr>
+      <w:r>
+        <w:rPr>
+          <w:rFonts w:ascii="Abadi" w:hAnsi="Abadi"/>
+          <w:color w:val="5A5A5A" w:themeColor="text1" w:themeTint="A5"/>
+          <w:sz w:val="28"/>
+          <w:szCs w:val="28"/>
+        </w:rPr>
+        <w:t>Create a function to create and display the grid layout.</w:t>
+      </w:r>
+      <w:r>
+        <w:rPr>
+          <w:rFonts w:ascii="Abadi" w:hAnsi="Abadi"/>
+          <w:noProof/>
+          <w:color w:val="5A5A5A" w:themeColor="text1" w:themeTint="A5"/>
+          <w:sz w:val="28"/>
+          <w:szCs w:val="28"/>
+        </w:rPr>
+        <w:t xml:space="preserve"> </w:t>
+      </w:r>
+      <w:r>
+        <w:rPr>
+          <w:rFonts w:ascii="Abadi" w:hAnsi="Abadi"/>
+          <w:noProof/>
+          <w:color w:val="5A5A5A" w:themeColor="text1" w:themeTint="A5"/>
+          <w:sz w:val="28"/>
+          <w:szCs w:val="28"/>
+        </w:rPr>
+        <w:drawing>
+          <wp:inline distT="0" distB="0" distL="0" distR="0" wp14:anchorId="0B1CA25B" wp14:editId="322777F9">
+            <wp:extent cx="4552950" cy="1425456"/>
+            <wp:effectExtent l="0" t="0" r="0" b="3810"/>
+            <wp:docPr id="287304635" name="Picture 3"/>
+            <wp:cNvGraphicFramePr>
+              <a:graphicFrameLocks xmlns:a="http://schemas.openxmlformats.org/drawingml/2006/main" noChangeAspect="1"/>
+            </wp:cNvGraphicFramePr>
+            <a:graphic xmlns:a="http://schemas.openxmlformats.org/drawingml/2006/main">
+              <a:graphicData uri="http://schemas.openxmlformats.org/drawingml/2006/picture">
+                <pic:pic xmlns:pic="http://schemas.openxmlformats.org/drawingml/2006/picture">
+                  <pic:nvPicPr>
+                    <pic:cNvPr id="0" name="Picture 3"/>
+                    <pic:cNvPicPr>
+                      <a:picLocks noChangeAspect="1" noChangeArrowheads="1"/>
+                    </pic:cNvPicPr>
+                  </pic:nvPicPr>
+                  <pic:blipFill>
+                    <a:blip r:embed="rId11">
+                      <a:extLst>
+                        <a:ext uri="{28A0092B-C50C-407E-A947-70E740481C1C}">
+                          <a14:useLocalDpi xmlns:a14="http://schemas.microsoft.com/office/drawing/2010/main" val="0"/>
+                        </a:ext>
+                      </a:extLst>
+                    </a:blip>
+                    <a:srcRect/>
+                    <a:stretch>
+                      <a:fillRect/>
+                    </a:stretch>
+                  </pic:blipFill>
+                  <pic:spPr bwMode="auto">
+                    <a:xfrm>
+                      <a:off x="0" y="0"/>
+                      <a:ext cx="4592609" cy="1437872"/>
+                    </a:xfrm>
+                    <a:prstGeom prst="rect">
+                      <a:avLst/>
+                    </a:prstGeom>
+                    <a:noFill/>
+                    <a:ln>
+                      <a:noFill/>
+                    </a:ln>
+                  </pic:spPr>
+                </pic:pic>
+              </a:graphicData>
+            </a:graphic>
+          </wp:inline>
+        </w:drawing>
       </w:r>
     </w:p>
     <w:p>
@@ -927,26 +1009,356 @@
         </w:numPr>
         <w:spacing w:line="360" w:lineRule="auto"/>
         <w:rPr>
-          <w:rStyle w:val="SubtleReference"/>
-          <w:rFonts w:ascii="Abadi" w:hAnsi="Abadi"/>
-        </w:rPr>
-      </w:pPr>
-      <w:r>
-        <w:rPr>
-          <w:rStyle w:val="SubtleReference"/>
-          <w:rFonts w:ascii="Abadi" w:hAnsi="Abadi"/>
-        </w:rPr>
-        <w:t>eg. Risk xyz (new)</w:t>
-      </w:r>
-    </w:p>
-    <w:p>
-      <w:pPr>
-        <w:spacing w:line="360" w:lineRule="auto"/>
-        <w:rPr>
-          <w:rStyle w:val="SubtleReference"/>
-          <w:rFonts w:ascii="Abadi" w:hAnsi="Abadi"/>
-        </w:rPr>
-      </w:pPr>
+          <w:rFonts w:ascii="Abadi" w:hAnsi="Abadi"/>
+          <w:color w:val="5A5A5A" w:themeColor="text1" w:themeTint="A5"/>
+          <w:sz w:val="28"/>
+          <w:szCs w:val="28"/>
+        </w:rPr>
+      </w:pPr>
+      <w:r>
+        <w:rPr>
+          <w:rFonts w:ascii="Abadi" w:hAnsi="Abadi"/>
+          <w:color w:val="5A5A5A" w:themeColor="text1" w:themeTint="A5"/>
+          <w:sz w:val="28"/>
+          <w:szCs w:val="28"/>
+        </w:rPr>
+        <w:t>Declaring bool variables for game conditions.</w:t>
+      </w:r>
+      <w:r>
+        <w:rPr>
+          <w:rFonts w:ascii="Abadi" w:hAnsi="Abadi"/>
+          <w:noProof/>
+          <w:color w:val="5A5A5A" w:themeColor="text1" w:themeTint="A5"/>
+          <w:sz w:val="28"/>
+          <w:szCs w:val="28"/>
+        </w:rPr>
+        <w:t xml:space="preserve"> </w:t>
+      </w:r>
+      <w:r>
+        <w:rPr>
+          <w:rFonts w:ascii="Abadi" w:hAnsi="Abadi"/>
+          <w:noProof/>
+          <w:color w:val="5A5A5A" w:themeColor="text1" w:themeTint="A5"/>
+          <w:sz w:val="28"/>
+          <w:szCs w:val="28"/>
+        </w:rPr>
+        <w:drawing>
+          <wp:inline distT="0" distB="0" distL="0" distR="0" wp14:anchorId="1D4B8F37" wp14:editId="76C1EF65">
+            <wp:extent cx="2638425" cy="561975"/>
+            <wp:effectExtent l="0" t="0" r="9525" b="9525"/>
+            <wp:docPr id="1658651859" name="Picture 4" descr="A green screen with white text&#10;&#10;Description automatically generated"/>
+            <wp:cNvGraphicFramePr>
+              <a:graphicFrameLocks xmlns:a="http://schemas.openxmlformats.org/drawingml/2006/main" noChangeAspect="1"/>
+            </wp:cNvGraphicFramePr>
+            <a:graphic xmlns:a="http://schemas.openxmlformats.org/drawingml/2006/main">
+              <a:graphicData uri="http://schemas.openxmlformats.org/drawingml/2006/picture">
+                <pic:pic xmlns:pic="http://schemas.openxmlformats.org/drawingml/2006/picture">
+                  <pic:nvPicPr>
+                    <pic:cNvPr id="1658651859" name="Picture 4" descr="A green screen with white text&#10;&#10;Description automatically generated"/>
+                    <pic:cNvPicPr>
+                      <a:picLocks noChangeAspect="1" noChangeArrowheads="1"/>
+                    </pic:cNvPicPr>
+                  </pic:nvPicPr>
+                  <pic:blipFill>
+                    <a:blip r:embed="rId12">
+                      <a:extLst>
+                        <a:ext uri="{28A0092B-C50C-407E-A947-70E740481C1C}">
+                          <a14:useLocalDpi xmlns:a14="http://schemas.microsoft.com/office/drawing/2010/main" val="0"/>
+                        </a:ext>
+                      </a:extLst>
+                    </a:blip>
+                    <a:srcRect/>
+                    <a:stretch>
+                      <a:fillRect/>
+                    </a:stretch>
+                  </pic:blipFill>
+                  <pic:spPr bwMode="auto">
+                    <a:xfrm>
+                      <a:off x="0" y="0"/>
+                      <a:ext cx="2638425" cy="561975"/>
+                    </a:xfrm>
+                    <a:prstGeom prst="rect">
+                      <a:avLst/>
+                    </a:prstGeom>
+                    <a:noFill/>
+                    <a:ln>
+                      <a:noFill/>
+                    </a:ln>
+                  </pic:spPr>
+                </pic:pic>
+              </a:graphicData>
+            </a:graphic>
+          </wp:inline>
+        </w:drawing>
+      </w:r>
+    </w:p>
+    <w:p>
+      <w:pPr>
+        <w:pStyle w:val="ColorfulList-Accent11"/>
+        <w:numPr>
+          <w:ilvl w:val="0"/>
+          <w:numId w:val="1"/>
+        </w:numPr>
+        <w:spacing w:line="360" w:lineRule="auto"/>
+        <w:rPr>
+          <w:rFonts w:ascii="Abadi" w:hAnsi="Abadi"/>
+          <w:color w:val="5A5A5A" w:themeColor="text1" w:themeTint="A5"/>
+          <w:sz w:val="28"/>
+          <w:szCs w:val="28"/>
+        </w:rPr>
+      </w:pPr>
+      <w:r>
+        <w:rPr>
+          <w:rFonts w:ascii="Abadi" w:hAnsi="Abadi"/>
+          <w:color w:val="5A5A5A" w:themeColor="text1" w:themeTint="A5"/>
+          <w:sz w:val="28"/>
+          <w:szCs w:val="28"/>
+        </w:rPr>
+        <w:lastRenderedPageBreak/>
+        <w:t>Implement a switch case game loop to update players positions based on the user command entered that moves players direction.</w:t>
+      </w:r>
+      <w:r>
+        <w:rPr>
+          <w:rFonts w:ascii="Abadi" w:hAnsi="Abadi"/>
+          <w:noProof/>
+          <w:color w:val="5A5A5A" w:themeColor="text1" w:themeTint="A5"/>
+          <w:sz w:val="28"/>
+          <w:szCs w:val="28"/>
+        </w:rPr>
+        <w:t xml:space="preserve"> </w:t>
+      </w:r>
+      <w:r>
+        <w:rPr>
+          <w:rFonts w:ascii="Abadi" w:hAnsi="Abadi"/>
+          <w:noProof/>
+          <w:color w:val="5A5A5A" w:themeColor="text1" w:themeTint="A5"/>
+          <w:sz w:val="28"/>
+          <w:szCs w:val="28"/>
+        </w:rPr>
+        <w:drawing>
+          <wp:inline distT="0" distB="0" distL="0" distR="0" wp14:anchorId="1713DB08" wp14:editId="1F6FA37E">
+            <wp:extent cx="4752975" cy="5123143"/>
+            <wp:effectExtent l="0" t="0" r="0" b="1905"/>
+            <wp:docPr id="1932930472" name="Picture 5" descr="A screenshot of a computer program&#10;&#10;Description automatically generated"/>
+            <wp:cNvGraphicFramePr>
+              <a:graphicFrameLocks xmlns:a="http://schemas.openxmlformats.org/drawingml/2006/main" noChangeAspect="1"/>
+            </wp:cNvGraphicFramePr>
+            <a:graphic xmlns:a="http://schemas.openxmlformats.org/drawingml/2006/main">
+              <a:graphicData uri="http://schemas.openxmlformats.org/drawingml/2006/picture">
+                <pic:pic xmlns:pic="http://schemas.openxmlformats.org/drawingml/2006/picture">
+                  <pic:nvPicPr>
+                    <pic:cNvPr id="1932930472" name="Picture 5" descr="A screenshot of a computer program&#10;&#10;Description automatically generated"/>
+                    <pic:cNvPicPr>
+                      <a:picLocks noChangeAspect="1" noChangeArrowheads="1"/>
+                    </pic:cNvPicPr>
+                  </pic:nvPicPr>
+                  <pic:blipFill>
+                    <a:blip r:embed="rId13">
+                      <a:extLst>
+                        <a:ext uri="{28A0092B-C50C-407E-A947-70E740481C1C}">
+                          <a14:useLocalDpi xmlns:a14="http://schemas.microsoft.com/office/drawing/2010/main" val="0"/>
+                        </a:ext>
+                      </a:extLst>
+                    </a:blip>
+                    <a:srcRect/>
+                    <a:stretch>
+                      <a:fillRect/>
+                    </a:stretch>
+                  </pic:blipFill>
+                  <pic:spPr bwMode="auto">
+                    <a:xfrm>
+                      <a:off x="0" y="0"/>
+                      <a:ext cx="4756915" cy="5127389"/>
+                    </a:xfrm>
+                    <a:prstGeom prst="rect">
+                      <a:avLst/>
+                    </a:prstGeom>
+                    <a:noFill/>
+                    <a:ln>
+                      <a:noFill/>
+                    </a:ln>
+                  </pic:spPr>
+                </pic:pic>
+              </a:graphicData>
+            </a:graphic>
+          </wp:inline>
+        </w:drawing>
+      </w:r>
+    </w:p>
+    <w:p>
+      <w:pPr>
+        <w:pStyle w:val="ColorfulList-Accent11"/>
+        <w:numPr>
+          <w:ilvl w:val="0"/>
+          <w:numId w:val="1"/>
+        </w:numPr>
+        <w:spacing w:line="360" w:lineRule="auto"/>
+        <w:rPr>
+          <w:rFonts w:ascii="Abadi" w:hAnsi="Abadi"/>
+          <w:color w:val="5A5A5A" w:themeColor="text1" w:themeTint="A5"/>
+          <w:sz w:val="28"/>
+          <w:szCs w:val="28"/>
+        </w:rPr>
+      </w:pPr>
+      <w:r>
+        <w:rPr>
+          <w:rFonts w:ascii="Abadi" w:hAnsi="Abadi"/>
+          <w:color w:val="5A5A5A" w:themeColor="text1" w:themeTint="A5"/>
+          <w:sz w:val="28"/>
+          <w:szCs w:val="28"/>
+        </w:rPr>
+        <w:t>Implement game conditions based on if player found the goal or touched death.</w:t>
+      </w:r>
+      <w:r>
+        <w:rPr>
+          <w:rFonts w:ascii="Abadi" w:hAnsi="Abadi"/>
+          <w:noProof/>
+          <w:color w:val="5A5A5A" w:themeColor="text1" w:themeTint="A5"/>
+          <w:sz w:val="28"/>
+          <w:szCs w:val="28"/>
+        </w:rPr>
+        <w:t xml:space="preserve"> </w:t>
+      </w:r>
+      <w:r>
+        <w:rPr>
+          <w:rFonts w:ascii="Abadi" w:hAnsi="Abadi"/>
+          <w:noProof/>
+          <w:color w:val="5A5A5A" w:themeColor="text1" w:themeTint="A5"/>
+          <w:sz w:val="28"/>
+          <w:szCs w:val="28"/>
+        </w:rPr>
+        <w:drawing>
+          <wp:inline distT="0" distB="0" distL="0" distR="0" wp14:anchorId="1FF10747" wp14:editId="473FC9EE">
+            <wp:extent cx="5181600" cy="1969331"/>
+            <wp:effectExtent l="0" t="0" r="0" b="0"/>
+            <wp:docPr id="1883945622" name="Picture 6" descr="A screenshot of a computer program&#10;&#10;Description automatically generated"/>
+            <wp:cNvGraphicFramePr>
+              <a:graphicFrameLocks xmlns:a="http://schemas.openxmlformats.org/drawingml/2006/main" noChangeAspect="1"/>
+            </wp:cNvGraphicFramePr>
+            <a:graphic xmlns:a="http://schemas.openxmlformats.org/drawingml/2006/main">
+              <a:graphicData uri="http://schemas.openxmlformats.org/drawingml/2006/picture">
+                <pic:pic xmlns:pic="http://schemas.openxmlformats.org/drawingml/2006/picture">
+                  <pic:nvPicPr>
+                    <pic:cNvPr id="1883945622" name="Picture 6" descr="A screenshot of a computer program&#10;&#10;Description automatically generated"/>
+                    <pic:cNvPicPr>
+                      <a:picLocks noChangeAspect="1" noChangeArrowheads="1"/>
+                    </pic:cNvPicPr>
+                  </pic:nvPicPr>
+                  <pic:blipFill>
+                    <a:blip r:embed="rId14">
+                      <a:extLst>
+                        <a:ext uri="{28A0092B-C50C-407E-A947-70E740481C1C}">
+                          <a14:useLocalDpi xmlns:a14="http://schemas.microsoft.com/office/drawing/2010/main" val="0"/>
+                        </a:ext>
+                      </a:extLst>
+                    </a:blip>
+                    <a:srcRect/>
+                    <a:stretch>
+                      <a:fillRect/>
+                    </a:stretch>
+                  </pic:blipFill>
+                  <pic:spPr bwMode="auto">
+                    <a:xfrm>
+                      <a:off x="0" y="0"/>
+                      <a:ext cx="5213537" cy="1981469"/>
+                    </a:xfrm>
+                    <a:prstGeom prst="rect">
+                      <a:avLst/>
+                    </a:prstGeom>
+                    <a:noFill/>
+                    <a:ln>
+                      <a:noFill/>
+                    </a:ln>
+                  </pic:spPr>
+                </pic:pic>
+              </a:graphicData>
+            </a:graphic>
+          </wp:inline>
+        </w:drawing>
+      </w:r>
+    </w:p>
+    <w:p>
+      <w:pPr>
+        <w:pStyle w:val="ColorfulList-Accent11"/>
+        <w:numPr>
+          <w:ilvl w:val="0"/>
+          <w:numId w:val="1"/>
+        </w:numPr>
+        <w:spacing w:line="360" w:lineRule="auto"/>
+        <w:rPr>
+          <w:rFonts w:ascii="Abadi" w:hAnsi="Abadi"/>
+          <w:color w:val="5A5A5A" w:themeColor="text1" w:themeTint="A5"/>
+          <w:sz w:val="28"/>
+          <w:szCs w:val="28"/>
+        </w:rPr>
+      </w:pPr>
+      <w:r>
+        <w:rPr>
+          <w:rFonts w:ascii="Abadi" w:hAnsi="Abadi"/>
+          <w:color w:val="5A5A5A" w:themeColor="text1" w:themeTint="A5"/>
+          <w:sz w:val="28"/>
+          <w:szCs w:val="28"/>
+        </w:rPr>
+        <w:lastRenderedPageBreak/>
+        <w:t>Finally implementing a win message if player won.</w:t>
+      </w:r>
+      <w:r>
+        <w:rPr>
+          <w:rFonts w:ascii="Abadi" w:hAnsi="Abadi"/>
+          <w:noProof/>
+          <w:color w:val="5A5A5A" w:themeColor="text1" w:themeTint="A5"/>
+          <w:sz w:val="28"/>
+          <w:szCs w:val="28"/>
+        </w:rPr>
+        <w:drawing>
+          <wp:inline distT="0" distB="0" distL="0" distR="0" wp14:anchorId="76B18A2E" wp14:editId="5FA1A26F">
+            <wp:extent cx="4857750" cy="855025"/>
+            <wp:effectExtent l="0" t="0" r="0" b="2540"/>
+            <wp:docPr id="2045502361" name="Picture 7"/>
+            <wp:cNvGraphicFramePr>
+              <a:graphicFrameLocks xmlns:a="http://schemas.openxmlformats.org/drawingml/2006/main" noChangeAspect="1"/>
+            </wp:cNvGraphicFramePr>
+            <a:graphic xmlns:a="http://schemas.openxmlformats.org/drawingml/2006/main">
+              <a:graphicData uri="http://schemas.openxmlformats.org/drawingml/2006/picture">
+                <pic:pic xmlns:pic="http://schemas.openxmlformats.org/drawingml/2006/picture">
+                  <pic:nvPicPr>
+                    <pic:cNvPr id="0" name="Picture 7"/>
+                    <pic:cNvPicPr>
+                      <a:picLocks noChangeAspect="1" noChangeArrowheads="1"/>
+                    </pic:cNvPicPr>
+                  </pic:nvPicPr>
+                  <pic:blipFill>
+                    <a:blip r:embed="rId15">
+                      <a:extLst>
+                        <a:ext uri="{28A0092B-C50C-407E-A947-70E740481C1C}">
+                          <a14:useLocalDpi xmlns:a14="http://schemas.microsoft.com/office/drawing/2010/main" val="0"/>
+                        </a:ext>
+                      </a:extLst>
+                    </a:blip>
+                    <a:srcRect/>
+                    <a:stretch>
+                      <a:fillRect/>
+                    </a:stretch>
+                  </pic:blipFill>
+                  <pic:spPr bwMode="auto">
+                    <a:xfrm>
+                      <a:off x="0" y="0"/>
+                      <a:ext cx="4878893" cy="858746"/>
+                    </a:xfrm>
+                    <a:prstGeom prst="rect">
+                      <a:avLst/>
+                    </a:prstGeom>
+                    <a:noFill/>
+                    <a:ln>
+                      <a:noFill/>
+                    </a:ln>
+                  </pic:spPr>
+                </pic:pic>
+              </a:graphicData>
+            </a:graphic>
+          </wp:inline>
+        </w:drawing>
+      </w:r>
     </w:p>
     <w:p>
       <w:pPr>
@@ -963,40 +1375,7 @@
           <w:b/>
           <w:sz w:val="24"/>
         </w:rPr>
-        <w:t xml:space="preserve">Recommendations </w:t>
-      </w:r>
-      <w:r>
-        <w:rPr>
-          <w:rFonts w:ascii="Abadi" w:hAnsi="Abadi"/>
-          <w:color w:val="FF0000"/>
-          <w:sz w:val="24"/>
-        </w:rPr>
-        <w:t xml:space="preserve">[Optional – </w:t>
-      </w:r>
-      <w:r>
-        <w:rPr>
-          <w:rFonts w:ascii="Abadi" w:hAnsi="Abadi"/>
-          <w:b/>
-          <w:color w:val="FF0000"/>
-          <w:sz w:val="24"/>
-        </w:rPr>
-        <w:t>remove</w:t>
-      </w:r>
-      <w:r>
-        <w:rPr>
-          <w:rFonts w:ascii="Abadi" w:hAnsi="Abadi"/>
-          <w:color w:val="FF0000"/>
-          <w:sz w:val="24"/>
-        </w:rPr>
-        <w:t xml:space="preserve"> heading/section if not used!]</w:t>
-      </w:r>
-      <w:r>
-        <w:rPr>
-          <w:rFonts w:ascii="Abadi" w:hAnsi="Abadi"/>
-          <w:b/>
-          <w:sz w:val="24"/>
-        </w:rPr>
-        <w:t>:</w:t>
+        <w:t>What we found out:</w:t>
       </w:r>
     </w:p>
     <w:p>
@@ -1004,50 +1383,92 @@
         <w:pStyle w:val="ColorfulList-Accent11"/>
         <w:spacing w:line="360" w:lineRule="auto"/>
         <w:ind w:left="0"/>
-        <w:rPr>
-          <w:rStyle w:val="SubtleReference"/>
-          <w:rFonts w:ascii="Abadi" w:hAnsi="Abadi"/>
-        </w:rPr>
-      </w:pPr>
-      <w:r>
-        <w:rPr>
-          <w:rStyle w:val="SubtleReference"/>
-          <w:rFonts w:ascii="Abadi" w:hAnsi="Abadi"/>
-        </w:rPr>
-        <w:lastRenderedPageBreak/>
-        <w:t xml:space="preserve">Often based on any open issues/risks </w:t>
-      </w:r>
-      <w:r>
-        <w:rPr>
-          <w:rStyle w:val="SubtleReference"/>
-          <w:rFonts w:ascii="Abadi" w:hAnsi="Abadi"/>
-        </w:rPr>
-        <w:t>i</w:t>
-      </w:r>
-      <w:r>
-        <w:rPr>
-          <w:rStyle w:val="SubtleReference"/>
-          <w:rFonts w:ascii="Abadi" w:hAnsi="Abadi"/>
-        </w:rPr>
-        <w:t xml:space="preserve">dentified. You may state that another spike is required to resolve new issues identified (or) indicate that this spike has increased </w:t>
-      </w:r>
-      <w:r>
-        <w:rPr>
-          <w:rStyle w:val="SubtleReference"/>
-          <w:rFonts w:ascii="Abadi" w:hAnsi="Abadi"/>
-        </w:rPr>
-        <w:t>your</w:t>
-      </w:r>
-      <w:r>
-        <w:rPr>
-          <w:rStyle w:val="SubtleReference"/>
-          <w:rFonts w:ascii="Abadi" w:hAnsi="Abadi"/>
-        </w:rPr>
-        <w:t xml:space="preserve"> confidence in XYZ and should move on.</w:t>
+        <w:jc w:val="both"/>
+        <w:rPr>
+          <w:rStyle w:val="SubtleReference"/>
+          <w:rFonts w:ascii="Abadi" w:hAnsi="Abadi"/>
+          <w:noProof/>
+        </w:rPr>
+      </w:pPr>
+      <w:r>
+        <w:rPr>
+          <w:rStyle w:val="SubtleReference"/>
+          <w:rFonts w:ascii="Abadi" w:hAnsi="Abadi"/>
+        </w:rPr>
+        <w:t xml:space="preserve">We found out that the player was able to move / teleport past walls so to fix this issue we had to update our switch case with else conditions to prevent player from moving towards a wall from that would be in the players way. </w:t>
+      </w:r>
+    </w:p>
+    <w:p>
+      <w:pPr>
+        <w:pStyle w:val="ColorfulList-Accent11"/>
+        <w:spacing w:line="360" w:lineRule="auto"/>
+        <w:ind w:left="0"/>
+        <w:rPr>
+          <w:rStyle w:val="SubtleReference"/>
+          <w:rFonts w:ascii="Abadi" w:hAnsi="Abadi"/>
+        </w:rPr>
+      </w:pPr>
+      <w:r>
+        <w:rPr>
+          <w:rStyle w:val="SubtleReference"/>
+          <w:rFonts w:ascii="Abadi" w:hAnsi="Abadi"/>
+          <w:noProof/>
+        </w:rPr>
+        <w:drawing>
+          <wp:inline distT="0" distB="0" distL="0" distR="0" wp14:anchorId="40ED74CD" wp14:editId="58D3FA19">
+            <wp:extent cx="5210175" cy="6248400"/>
+            <wp:effectExtent l="0" t="0" r="9525" b="0"/>
+            <wp:docPr id="972921562" name="Picture 8"/>
+            <wp:cNvGraphicFramePr>
+              <a:graphicFrameLocks xmlns:a="http://schemas.openxmlformats.org/drawingml/2006/main" noChangeAspect="1"/>
+            </wp:cNvGraphicFramePr>
+            <a:graphic xmlns:a="http://schemas.openxmlformats.org/drawingml/2006/main">
+              <a:graphicData uri="http://schemas.openxmlformats.org/drawingml/2006/picture">
+                <pic:pic xmlns:pic="http://schemas.openxmlformats.org/drawingml/2006/picture">
+                  <pic:nvPicPr>
+                    <pic:cNvPr id="0" name="Picture 8"/>
+                    <pic:cNvPicPr>
+                      <a:picLocks noChangeAspect="1" noChangeArrowheads="1"/>
+                    </pic:cNvPicPr>
+                  </pic:nvPicPr>
+                  <pic:blipFill rotWithShape="1">
+                    <a:blip r:embed="rId16">
+                      <a:extLst>
+                        <a:ext uri="{28A0092B-C50C-407E-A947-70E740481C1C}">
+                          <a14:useLocalDpi xmlns:a14="http://schemas.microsoft.com/office/drawing/2010/main" val="0"/>
+                        </a:ext>
+                      </a:extLst>
+                    </a:blip>
+                    <a:srcRect l="9048" t="6998" r="5616" b="4712"/>
+                    <a:stretch/>
+                  </pic:blipFill>
+                  <pic:spPr bwMode="auto">
+                    <a:xfrm>
+                      <a:off x="0" y="0"/>
+                      <a:ext cx="5210175" cy="6248400"/>
+                    </a:xfrm>
+                    <a:prstGeom prst="rect">
+                      <a:avLst/>
+                    </a:prstGeom>
+                    <a:noFill/>
+                    <a:ln>
+                      <a:noFill/>
+                    </a:ln>
+                    <a:extLst>
+                      <a:ext uri="{53640926-AAD7-44D8-BBD7-CCE9431645EC}">
+                        <a14:shadowObscured xmlns:a14="http://schemas.microsoft.com/office/drawing/2010/main"/>
+                      </a:ext>
+                    </a:extLst>
+                  </pic:spPr>
+                </pic:pic>
+              </a:graphicData>
+            </a:graphic>
+          </wp:inline>
+        </w:drawing>
       </w:r>
     </w:p>
     <w:sectPr>
-      <w:headerReference w:type="default" r:id="rId9"/>
+      <w:headerReference w:type="default" r:id="rId17"/>
       <w:pgSz w:w="11900" w:h="16840"/>
       <w:pgMar w:top="1440" w:right="1134" w:bottom="1440" w:left="1134" w:header="709" w:footer="709" w:gutter="0"/>
       <w:cols w:space="708"/>
@@ -1128,7 +1549,7 @@
       <w:rPr>
         <w:noProof/>
       </w:rPr>
-      <w:t>9/08/23</w:t>
+      <w:t>16/08/23</w:t>
     </w:r>
     <w:r>
       <w:fldChar w:fldCharType="end"/>

</xml_diff>